<commit_message>
Buch 6: Upload-Paket vor Veröffentlichung aktualisiert
Beim erneuten Hochladen-Wunsch geprüft und korrigiert:
- Zwei Gedankenstriche im Manuskript durch Kommas ersetzt (Regel:
  keine Gedankenstriche im Fliesstext)
- Cover-Skript hatte die Seitenzahl fest auf 111 eingetragen, obwohl
  das Manuskript inzwischen 113 Seiten hat, Rücken war dadurch zu
  schmal berechnet, jetzt korrigiert und Cover neu gebaut
- KDP-Upload-Anleitung.md war seit Juli veraltet: Seitenzahl, Rücken-
  und Covermasse sowie die Previewer-Seitenangaben aktualisiert
- Beschreibungstext für die Amazon-Produktseite nannte Petra noch
  "Coachin" statt "Autorin und Mentorin" (alte Berufsbezeichnung,
  Verstoss gegen rechtssicherheit.md), korrigiert
- eBook neu gebaut, keine Coach-Reste, keine Gedankenstriche

Co-Authored-By: Claude Sonnet 5 <noreply@anthropic.com>
Claude-Session: https://claude.ai/code/session_011oFtWvyjvkDdc6K2GcSXHx
</commit_message>
<xml_diff>
--- a/outputs/buch6/buch6-MANUSKRIPT.docx
+++ b/outputs/buch6/buch6-MANUSKRIPT.docx
@@ -18775,7 +18775,7 @@
         <w:jc w:val="both"/>
       </w:pPr>
       <w:r>
-        <w:t>Zu diesem Buch gibt es auch ein Journal: „Ich bin so müde. — Das Journal“, mit Reflexionsfragen und Schreibraum zu jedem Kapitel. Erhältlich ebenfalls bei Amazon.</w:t>
+        <w:t>Zu diesem Buch gibt es auch ein Journal: „Ich bin so müde, das Journal“, mit Reflexionsfragen und Schreibraum zu jedem Kapitel. Erhältlich ebenfalls bei Amazon.</w:t>
       </w:r>
     </w:p>
     <w:p>
@@ -19886,7 +19886,7 @@
         <w:rPr>
           <w:sz w:val="18"/>
         </w:rPr>
-        <w:t>Facebook-Gruppe: Safe to Thrive — Dein Leben. Deine Regeln, https://www.facebook.com/share/g/17ca96zXDd/</w:t>
+        <w:t>Facebook-Gruppe: Safe to Thrive, Dein Leben. Deine Regeln, https://www.facebook.com/share/g/17ca96zXDd/</w:t>
       </w:r>
     </w:p>
     <w:p>

</xml_diff>

<commit_message>
Ich bin so müde...: Dopplungen gestrafft, Lektorats-Befund
Kapitel 8 und 10 behandelten dasselbe Thema (schlechtes Gewissen beim
Nein-Sagen), funktional getrennt. "Nein ist ein vollstaendiger Satz" lief
doppelt, "X ist kein Versagen, es ist Y" viermal - auf je eine Stelle
reduziert bzw. umformuliert. Kapitel 16 endete mit einem bekannten
Instagram-Zitat statt eigener Stimme, ersetzt. Kernstellen (Kap. 3, 9,
10, 14, 17, Funktions-Ich als Markenbegriff) unangetastet.

buch-pruefen.py: keine neuen Befunde. Seiten 113 -> 113 (unveraendert).

Co-Authored-By: Claude Sonnet 5 <noreply@anthropic.com>
Claude-Session: https://claude.ai/code/session_011oFtWvyjvkDdc6K2GcSXHx
</commit_message>
<xml_diff>
--- a/outputs/buch6/buch6-MANUSKRIPT.docx
+++ b/outputs/buch6/buch6-MANUSKRIPT.docx
@@ -4400,14 +4400,6 @@
         <w:jc w:val="both"/>
       </w:pPr>
       <w:r>
-        <w:t>Das ist kein Versagen.</w:t>
-      </w:r>
-    </w:p>
-    <w:p>
-      <w:pPr>
-        <w:jc w:val="both"/>
-      </w:pPr>
-      <w:r>
         <w:t>Du hast getan, was du gelernt hast.</w:t>
       </w:r>
     </w:p>
@@ -7472,15 +7464,6 @@
         <w:jc w:val="both"/>
       </w:pPr>
       <w:r>
-        <w:lastRenderedPageBreak/>
-        <w:t>Das ist kein Versagen.</w:t>
-      </w:r>
-    </w:p>
-    <w:p>
-      <w:pPr>
-        <w:jc w:val="both"/>
-      </w:pPr>
-      <w:r>
         <w:t>Es ist ein Signal.</w:t>
       </w:r>
     </w:p>
@@ -8994,57 +8977,41 @@
         <w:jc w:val="both"/>
       </w:pPr>
       <w:r>
-        <w:t>Es ist eine Grenze.</w:t>
-      </w:r>
-    </w:p>
-    <w:p>
-      <w:pPr>
-        <w:spacing w:after="71"/>
-      </w:pPr>
-    </w:p>
-    <w:p>
-      <w:pPr>
-        <w:jc w:val="both"/>
-      </w:pPr>
-      <w:r>
-        <w:t>Und Grenzen bedeuten nicht Menschen zurückzustossen.</w:t>
-      </w:r>
-    </w:p>
-    <w:p>
-      <w:pPr>
-        <w:jc w:val="both"/>
-      </w:pPr>
-      <w:r>
-        <w:t>Sie bedeuten ehrlich zu sein.</w:t>
-      </w:r>
-    </w:p>
-    <w:p>
-      <w:pPr>
-        <w:jc w:val="both"/>
-      </w:pPr>
-      <w:r>
-        <w:t>Mit dir. Mit anderen.</w:t>
-      </w:r>
-    </w:p>
-    <w:p>
-      <w:pPr>
-        <w:spacing w:after="71"/>
-      </w:pPr>
-    </w:p>
-    <w:p>
-      <w:pPr>
-        <w:jc w:val="both"/>
-      </w:pPr>
-      <w:r>
-        <w:t>Beziehungen ohne Grenzen sind keine Beziehungen.</w:t>
-      </w:r>
-    </w:p>
-    <w:p>
-      <w:pPr>
-        <w:jc w:val="both"/>
-      </w:pPr>
-      <w:r>
-        <w:t>Sie sind Selbstaufopferung.</w:t>
+        <w:t>Es ist nur ungewohnt.</w:t>
+      </w:r>
+    </w:p>
+    <w:p>
+      <w:pPr>
+        <w:spacing w:after="71"/>
+      </w:pPr>
+    </w:p>
+    <w:p>
+      <w:pPr>
+        <w:jc w:val="both"/>
+      </w:pPr>
+      <w:r>
+        <w:t>Und ungewohnt fühlt sich lange wie falsch an, obwohl es das nicht ist.</w:t>
+      </w:r>
+    </w:p>
+    <w:p>
+      <w:pPr>
+        <w:spacing w:after="71"/>
+      </w:pPr>
+    </w:p>
+    <w:p>
+      <w:pPr>
+        <w:jc w:val="both"/>
+      </w:pPr>
+      <w:r>
+        <w:t>Das Muster, das du als Kind gelernt hast, kennt diesen Unterschied nicht.</w:t>
+      </w:r>
+    </w:p>
+    <w:p>
+      <w:pPr>
+        <w:jc w:val="both"/>
+      </w:pPr>
+      <w:r>
+        <w:t>Es schlägt bei jedem Nein genauso Alarm wie bei echter Gefahr.</w:t>
       </w:r>
     </w:p>
     <w:p>
@@ -9057,63 +9024,19 @@
         <w:jc w:val="both"/>
       </w:pPr>
       <w:r>
-        <w:t>Ein Nein, das gut ist, klingt so:</w:t>
-      </w:r>
-    </w:p>
-    <w:p>
-      <w:pPr>
-        <w:jc w:val="both"/>
-      </w:pPr>
-      <w:r>
-        <w:t xml:space="preserve">„Das geht für mich gerade </w:t>
+        <w:t>Woher es kommt, weisst du jetzt.</w:t>
+      </w:r>
+    </w:p>
+    <w:p>
+      <w:pPr>
+        <w:jc w:val="both"/>
+      </w:pPr>
+      <w:r>
+        <w:t>Was du damit machst, kommt noch.</w:t>
       </w:r>
       <w:proofErr w:type="gramStart"/>
-      <w:r>
-        <w:t>nicht.“</w:t>
-      </w:r>
+      <w:r/>
       <w:proofErr w:type="gramEnd"/>
-    </w:p>
-    <w:p>
-      <w:pPr>
-        <w:spacing w:after="71"/>
-      </w:pPr>
-    </w:p>
-    <w:p>
-      <w:pPr>
-        <w:jc w:val="both"/>
-      </w:pPr>
-      <w:r>
-        <w:t>Kurz. Klar. Kein Roman.</w:t>
-      </w:r>
-    </w:p>
-    <w:p>
-      <w:pPr>
-        <w:jc w:val="both"/>
-      </w:pPr>
-      <w:r>
-        <w:t>Keine Entschuldigung.</w:t>
-      </w:r>
-    </w:p>
-    <w:p>
-      <w:pPr>
-        <w:jc w:val="both"/>
-      </w:pPr>
-      <w:r>
-        <w:t>Kein Grund.</w:t>
-      </w:r>
-    </w:p>
-    <w:p>
-      <w:pPr>
-        <w:spacing w:after="71"/>
-      </w:pPr>
-    </w:p>
-    <w:p>
-      <w:pPr>
-        <w:jc w:val="both"/>
-      </w:pPr>
-      <w:r>
-        <w:t>Ein Nein ist ein vollständiger Satz.</w:t>
-      </w:r>
     </w:p>
     <w:p>
       <w:pPr>
@@ -10960,14 +10883,6 @@
     </w:p>
     <w:p>
       <w:pPr>
-        <w:jc w:val="both"/>
-      </w:pPr>
-      <w:r>
-        <w:t>Du wirkst ja so stark.</w:t>
-      </w:r>
-    </w:p>
-    <w:p>
-      <w:pPr>
         <w:spacing w:after="71"/>
       </w:pPr>
     </w:p>
@@ -12031,27 +11946,6 @@
         <w:jc w:val="both"/>
       </w:pPr>
       <w:r>
-        <w:t>Beziehungen, die nur funktionieren, wenn du keine Bedürfnisse hast, sind keine Beziehungen.</w:t>
-      </w:r>
-    </w:p>
-    <w:p>
-      <w:pPr>
-        <w:jc w:val="both"/>
-      </w:pPr>
-      <w:r>
-        <w:t>Das ist eine Dienstleistung.</w:t>
-      </w:r>
-    </w:p>
-    <w:p>
-      <w:pPr>
-        <w:spacing w:after="71"/>
-      </w:pPr>
-    </w:p>
-    <w:p>
-      <w:pPr>
-        <w:jc w:val="both"/>
-      </w:pPr>
-      <w:r>
         <w:t>Anna hat mit etwas angefangen, das lächerlich klein klingt.</w:t>
       </w:r>
     </w:p>
@@ -14602,7 +14496,7 @@
           <w:b/>
           <w:i/>
         </w:rPr>
-        <w:t xml:space="preserve">„Wenn jemand geht, weil du Grenzen setzt, hat er nie dich geliebt. Nur was du geleistet </w:t>
+        <w:t>„Eine Freundschaft wurde kühler, als ich anfing, Nein zu sagen. Da wusste ich: Sie hatte nie mich gemeint. Nur, was ich für sie tat.“</w:t>
       </w:r>
       <w:proofErr w:type="gramStart"/>
       <w:r>
@@ -14610,7 +14504,6 @@
           <w:b/>
           <w:i/>
         </w:rPr>
-        <w:t>hast.“</w:t>
       </w:r>
       <w:proofErr w:type="gramEnd"/>
     </w:p>
@@ -17464,7 +17357,7 @@
         <w:jc w:val="both"/>
       </w:pPr>
       <w:r>
-        <w:t>Das ist kein Versagen.</w:t>
+        <w:t>Das macht dich nicht kleiner.</w:t>
       </w:r>
     </w:p>
     <w:p>
@@ -17664,7 +17557,7 @@
         <w:jc w:val="both"/>
       </w:pPr>
       <w:r>
-        <w:t>Erschöpfung ist Information.</w:t>
+        <w:t>Es ist die Stimme, die lauter wird, wenn das Funktions-Ich zu lange allein entschieden hat.</w:t>
       </w:r>
     </w:p>
     <w:p>
@@ -17778,23 +17671,23 @@
         <w:jc w:val="both"/>
       </w:pPr>
       <w:r>
-        <w:t>Du darfst aufhören.</w:t>
-      </w:r>
-    </w:p>
-    <w:p>
-      <w:pPr>
-        <w:jc w:val="both"/>
-      </w:pPr>
-      <w:r>
-        <w:t>Du darfst müde sein.</w:t>
-      </w:r>
-    </w:p>
-    <w:p>
-      <w:pPr>
-        <w:jc w:val="both"/>
-      </w:pPr>
-      <w:r>
-        <w:t>Du darfst du sein.</w:t>
+        <w:t>Das Funktions-Ich durfte lange für dich antworten.</w:t>
+      </w:r>
+    </w:p>
+    <w:p>
+      <w:pPr>
+        <w:jc w:val="both"/>
+      </w:pPr>
+      <w:r>
+        <w:t>Heute antwortest du selbst.</w:t>
+      </w:r>
+    </w:p>
+    <w:p>
+      <w:pPr>
+        <w:jc w:val="both"/>
+      </w:pPr>
+      <w:r>
+        <w:t>Müde. Echt. Du.</w:t>
       </w:r>
     </w:p>
     <w:p>

</xml_diff>

<commit_message>
Ich bin so müde: fast leere Seite 14 behoben
Petra hat zurecht bemaengelt, dass Seite 14 nur einen einzelnen Satz
enthielt. Ursache: ein eingebetteter harter Seitenumbruch direkt nach
"Knick die Ecke um. Du wirst sie wieder suchen." isolierte diesen Satz
auf einer eigenen, fast leeren Seite, bevor "SCHRITT 1: SEHEN" auf der
naechsten Seite begann. Den Satz mit dem vorangehenden "Deshalb steht
diese Seite so weit vorne." zusammengefuehrt und den isolierenden
Seitenumbruch entfernt - "SCHRITT 1: SEHEN" folgt jetzt direkt auf
derselben Seite, keine fast leere Seite mehr.

buch-pruefen.py: "fast leere Seiten" jetzt OK (vorher Befund), 10 statt
11 Auffaelligkeiten insgesamt, keine neuen. Seiten 113 -> 112, Cover-
Ruecken entsprechend neu berechnet (7.11mm).

Co-Authored-By: Claude Sonnet 5 <noreply@anthropic.com>
Claude-Session: https://claude.ai/code/session_011oFtWvyjvkDdc6K2GcSXHx
</commit_message>
<xml_diff>
--- a/outputs/buch6/buch6-MANUSKRIPT.docx
+++ b/outputs/buch6/buch6-MANUSKRIPT.docx
@@ -3720,26 +3720,11 @@
         <w:jc w:val="both"/>
       </w:pPr>
       <w:r>
-        <w:t>Deshalb steht diese Seite so weit vorne.</w:t>
-      </w:r>
-    </w:p>
-    <w:p>
-      <w:pPr>
-        <w:spacing w:after="71"/>
-      </w:pPr>
-    </w:p>
-    <w:p>
-      <w:pPr>
-        <w:jc w:val="both"/>
-      </w:pPr>
-      <w:r>
-        <w:t>Knick die Ecke um. Du wirst sie wieder suchen.</w:t>
-      </w:r>
-    </w:p>
-    <w:p>
-      <w:r>
-        <w:br w:type="page"/>
-      </w:r>
+        <w:t>Deshalb steht diese Seite so weit vorne. Knick die Ecke um, du wirst sie wieder suchen.</w:t>
+      </w:r>
+    </w:p>
+    <w:p>
+      <w:r/>
     </w:p>
     <w:p>
       <w:pPr>

</xml_diff>